<commit_message>
docs: ajustar formato final PDF - portada con logo UAE, header/footer con Grupo #1, diseno limpio
</commit_message>
<xml_diff>
--- a/docs/plantilla-uae.docx
+++ b/docs/plantilla-uae.docx
@@ -3,24 +3,15 @@
 <w:document xmlns:wpc="http://schemas.microsoft.com/office/word/2010/wordprocessingCanvas" xmlns:mo="http://schemas.microsoft.com/office/mac/office/2008/main" xmlns:mc="http://schemas.openxmlformats.org/markup-compatibility/2006" xmlns:mv="urn:schemas-microsoft-com:mac:vml" xmlns:o="urn:schemas-microsoft-com:office:office" xmlns:r="http://schemas.openxmlformats.org/officeDocument/2006/relationships" xmlns:m="http://schemas.openxmlformats.org/officeDocument/2006/math" xmlns:v="urn:schemas-microsoft-com:vml" xmlns:wp14="http://schemas.microsoft.com/office/word/2010/wordprocessingDrawing" xmlns:wp="http://schemas.openxmlformats.org/drawingml/2006/wordprocessingDrawing" xmlns:w10="urn:schemas-microsoft-com:office:word" xmlns:w="http://schemas.openxmlformats.org/wordprocessingml/2006/main" xmlns:w14="http://schemas.microsoft.com/office/word/2010/wordml" xmlns:wpg="http://schemas.microsoft.com/office/word/2010/wordprocessingGroup" xmlns:wpi="http://schemas.microsoft.com/office/word/2010/wordprocessingInk" xmlns:wne="http://schemas.microsoft.com/office/word/2006/wordml" xmlns:wps="http://schemas.microsoft.com/office/word/2010/wordprocessingShape" mc:Ignorable="w14 wp14">
   <w:body>
     <w:p>
-      <w:pPr>
-        <w:pStyle w:val="Heading1"/>
-      </w:pPr>
       <w:r>
-        <w:t>Contenido de ejemplo para plantilla</w:t>
-      </w:r>
-    </w:p>
-    <w:p>
-      <w:pPr/>
-      <w:r>
-        <w:t>Texto de ejemplo justificado para verificar que la plantilla funciona correctamente en la conversión con pandoc.</w:t>
+        <w:t>Plantilla academica UAE — Grupo #1</w:t>
       </w:r>
     </w:p>
     <w:sectPr>
       <w:headerReference w:type="default" r:id="rId9"/>
       <w:footerReference w:type="default" r:id="rId10"/>
       <w:pgSz w:w="11906" w:h="16838"/>
-      <w:pgMar w:top="1417" w:right="1417" w:bottom="1417" w:left="1417" w:header="720" w:footer="720" w:gutter="0"/>
+      <w:pgMar w:top="1440" w:right="1440" w:bottom="1440" w:left="1440" w:header="720" w:footer="720" w:gutter="0"/>
       <w:cols w:space="720"/>
       <w:docGrid w:linePitch="360"/>
     </w:sectPr>
@@ -33,28 +24,25 @@
   <w:p>
     <w:pPr>
       <w:pStyle w:val="Footer"/>
+      <w:spacing w:before="0" w:after="0"/>
       <w:jc w:val="center"/>
       <w:pBdr>
-        <w:top w:val="single" w:sz="4" w:space="1" w:color="DDDDDD"/>
+        <w:top w:val="single" w:sz="2" w:space="4" w:color="DDDDDD"/>
       </w:pBdr>
     </w:pPr>
     <w:r>
       <w:rPr>
         <w:rFonts w:ascii="Calibri" w:hAnsi="Calibri"/>
-        <w:color w:val="828282"/>
-        <w:sz w:val="16"/>
-      </w:rPr>
-      <w:t xml:space="preserve">Henry Pazmiño — Grupo #1  |  Pág. </w:t>
+        <w:color w:val="969696"/>
+        <w:sz w:val="15"/>
+      </w:rPr>
+      <w:t xml:space="preserve">Grupo #1 — Programacion 2  |  Pag. </w:t>
     </w:r>
-    <w:r>
-      <w:fldChar w:fldCharType="begin"/>
-    </w:r>
-    <w:r>
-      <w:instrText xml:space="preserve"> PAGE </w:instrText>
-    </w:r>
-    <w:r>
-      <w:fldChar w:fldCharType="end"/>
-    </w:r>
+    <w:fldSimple w:instr=" PAGE ">
+      <w:r>
+        <w:t>1</w:t>
+      </w:r>
+    </w:fldSimple>
   </w:p>
 </w:ftr>
 </file>
@@ -64,18 +52,19 @@
   <w:p>
     <w:pPr>
       <w:pStyle w:val="Header"/>
+      <w:spacing w:before="0" w:after="0"/>
       <w:jc w:val="right"/>
       <w:pBdr>
-        <w:bottom w:val="single" w:sz="4" w:space="1" w:color="1B4F72"/>
+        <w:bottom w:val="single" w:sz="2" w:space="4" w:color="BBBBBB"/>
       </w:pBdr>
     </w:pPr>
     <w:r>
       <w:rPr>
         <w:rFonts w:ascii="Calibri" w:hAnsi="Calibri"/>
-        <w:color w:val="828282"/>
-        <w:sz w:val="16"/>
-      </w:rPr>
-      <w:t>Universidad Agraria del Ecuador  |  Grupo #1 — Programación 2  |  3er Semestre</w:t>
+        <w:color w:val="969696"/>
+        <w:sz w:val="15"/>
+      </w:rPr>
+      <w:t>UAE  |  Grupo #1 — Programacion 2  |  3er Semestre</w:t>
     </w:r>
   </w:p>
 </w:hdr>
@@ -445,7 +434,7 @@
     <w:qFormat/>
     <w:rsid w:val="00FC693F"/>
     <w:pPr>
-      <w:spacing w:before="60" w:after="120" w:line="276" w:lineRule="auto"/>
+      <w:spacing w:before="0" w:after="120" w:line="276" w:lineRule="auto"/>
       <w:jc w:val="both"/>
     </w:pPr>
     <w:rPr>
@@ -508,7 +497,7 @@
     <w:pPr>
       <w:keepNext/>
       <w:keepLines/>
-      <w:spacing w:before="360" w:after="160"/>
+      <w:spacing w:before="360" w:after="120"/>
       <w:outlineLvl w:val="0"/>
     </w:pPr>
     <w:rPr>
@@ -516,7 +505,7 @@
       <w:b/>
       <w:bCs/>
       <w:color w:val="1B4F72"/>
-      <w:sz w:val="32"/>
+      <w:sz w:val="28"/>
       <w:szCs w:val="28"/>
     </w:rPr>
   </w:style>
@@ -532,15 +521,15 @@
     <w:pPr>
       <w:keepNext/>
       <w:keepLines/>
-      <w:spacing w:before="280" w:after="120"/>
+      <w:spacing w:before="280" w:after="80"/>
       <w:outlineLvl w:val="1"/>
     </w:pPr>
     <w:rPr>
       <w:rFonts w:asciiTheme="majorHAnsi" w:eastAsiaTheme="majorEastAsia" w:hAnsiTheme="majorHAnsi" w:cstheme="majorBidi" w:ascii="Calibri" w:hAnsi="Calibri"/>
       <w:b/>
       <w:bCs/>
-      <w:color w:val="2E86C1"/>
-      <w:sz w:val="28"/>
+      <w:color w:val="2980B9"/>
+      <w:sz w:val="24"/>
       <w:szCs w:val="26"/>
     </w:rPr>
   </w:style>
@@ -563,8 +552,8 @@
       <w:rFonts w:asciiTheme="majorHAnsi" w:eastAsiaTheme="majorEastAsia" w:hAnsiTheme="majorHAnsi" w:cstheme="majorBidi" w:ascii="Calibri" w:hAnsi="Calibri"/>
       <w:b/>
       <w:bCs/>
-      <w:color w:val="3498DB"/>
-      <w:sz w:val="24"/>
+      <w:color w:val="34495E"/>
+      <w:sz w:val="22"/>
     </w:rPr>
   </w:style>
   <w:style w:type="paragraph" w:styleId="Heading4">
@@ -1395,8 +1384,7 @@
     <w:uiPriority w:val="59"/>
     <w:rsid w:val="00FC693F"/>
     <w:pPr>
-      <w:spacing w:after="40" w:line="240" w:lineRule="auto" w:before="40"/>
-      <w:jc w:val="left"/>
+      <w:spacing w:after="0" w:line="240" w:lineRule="auto"/>
     </w:pPr>
     <w:rPr>
       <w:rFonts w:ascii="Calibri" w:hAnsi="Calibri"/>
@@ -12140,16 +12128,6 @@
         <w:shd w:val="clear" w:color="auto" w:fill="FBCAA2" w:themeFill="accent6" w:themeFillTint="7F"/>
       </w:tcPr>
     </w:tblStylePr>
-  </w:style>
-  <w:style w:type="paragraph" w:customStyle="1" w:styleId="Code">
-    <w:name w:val="Code"/>
-    <w:pPr>
-      <w:spacing w:before="40" w:after="40" w:line="240" w:lineRule="auto"/>
-    </w:pPr>
-    <w:rPr>
-      <w:rFonts w:ascii="Consolas" w:hAnsi="Consolas"/>
-      <w:sz w:val="16"/>
-    </w:rPr>
   </w:style>
 </w:styles>
 </file>

</xml_diff>